<commit_message>
Expand callback assignee controls and prune completed plan tasks
</commit_message>
<xml_diff>
--- a/docs/project-completion-plan-managers.docx
+++ b/docs/project-completion-plan-managers.docx
@@ -50,47 +50,7 @@
         <w:pageBreakBefore w:val="0"/>
       </w:pPr>
       <w:r>
-        <w:t>1 Проверить письма о заказах и заявках</w:t>
-      </w:r>
-    </w:p>
-    <w:p>
-      <w:pPr>
-        <w:pStyle w:val="ListBullet"/>
-        <w:pageBreakBefore w:val="0"/>
-      </w:pPr>
-      <w:r>
-        <w:t>Проверить, что покупатель и менеджеры получают нужные письма о тестовом заказе, а менеджеры — уведомление о заявке на обратный звонок.</w:t>
-      </w:r>
-    </w:p>
-    <w:p>
-      <w:pPr>
-        <w:pStyle w:val="ListBullet"/>
-        <w:keepNext/>
-        <w:pageBreakBefore w:val="0"/>
-      </w:pPr>
-      <w:r>
-        <w:t>Обеспечить понятный результат оформления при сбое отправки письма: принятый заказ должен оставаться доступным менеджеру, а уведомление — отправляться после устранения сбоя.</w:t>
-      </w:r>
-    </w:p>
-    <w:p>
-      <w:pPr>
-        <w:pageBreakBefore w:val="0"/>
-        <w:spacing w:after="180"/>
-      </w:pPr>
-      <w:r>
-        <w:rPr>
-          <w:i/>
-        </w:rPr>
-        <w:t>Результат: заказ принят, покупатель видит подтверждение, уведомления доходят адресатам.</w:t>
-      </w:r>
-    </w:p>
-    <w:p>
-      <w:pPr>
-        <w:pStyle w:val="Heading2"/>
-        <w:pageBreakBefore w:val="0"/>
-      </w:pPr>
-      <w:r>
-        <w:t>2 Уточнить наличие и резервирование</w:t>
+        <w:t>1 Уточнить наличие и резервирование</w:t>
       </w:r>
     </w:p>
     <w:p>
@@ -139,7 +99,7 @@
         <w:pageBreakBefore w:val="0"/>
       </w:pPr>
       <w:r>
-        <w:t>3 Завершить внешнее наблюдение за сайтом</w:t>
+        <w:t>2 Завершить внешнее наблюдение за сайтом</w:t>
       </w:r>
     </w:p>
     <w:p>
@@ -148,7 +108,7 @@
         <w:pageBreakBefore w:val="0"/>
       </w:pPr>
       <w:r>
-        <w:t>Проверять извне доступность сайта, запуск фоновых задач, свежесть резервных копий и свободное место.</w:t>
+        <w:t>Разместить независимый монитор вне Jino, чтобы обнаруживать полный отказ общего хостинга и остановку самого сборщика наблюдения.</w:t>
       </w:r>
     </w:p>
     <w:p>
@@ -157,7 +117,15 @@
         <w:pageBreakBefore w:val="0"/>
       </w:pPr>
       <w:r>
-        <w:t>Провести на хостинге проверку обнаружения сбоя уведомлений и отчёта о восстановлении после устранения причины.</w:t>
+        <w:t>Подключить контроль остатка дисковой квоты аккаунта Jino: свободное место общей файловой системы не показывает остаток квоты.</w:t>
+      </w:r>
+    </w:p>
+    <w:p>
+      <w:pPr>
+        <w:pStyle w:val="ListBullet"/>
+      </w:pPr>
+      <w:r>
+        <w:t>Настроить актуальные журналы Apache и сбор ошибок до запуска приложения. Проверить оповещения всех новых источников наблюдения.</w:t>
       </w:r>
     </w:p>
     <w:p>
@@ -169,7 +137,7 @@
         <w:rPr>
           <w:i/>
         </w:rPr>
-        <w:t>Результат: ответственный получает сообщение о сбое сайта, уведомлений или резервирования и о восстановлении работы.</w:t>
+        <w:t>Результат: независимый монитор, контроль квоты и сбор ошибок подключены, их оповещения проверены.</w:t>
       </w:r>
     </w:p>
     <w:p>
@@ -178,7 +146,7 @@
         <w:pageBreakBefore w:val="0"/>
       </w:pPr>
       <w:r>
-        <w:t>4 Завершить обновление PHP на хостинге</w:t>
+        <w:t>3 Завершить обновление PHP на хостинге</w:t>
       </w:r>
     </w:p>
     <w:p>
@@ -227,7 +195,7 @@
         <w:pageBreakBefore w:val="0"/>
       </w:pPr>
       <w:r>
-        <w:t>5 Доработать работу менеджера с заказом</w:t>
+        <w:t>4 Доработать работу менеджера с заказом</w:t>
       </w:r>
     </w:p>
     <w:p>
@@ -294,7 +262,7 @@
         <w:pageBreakBefore w:val="0"/>
       </w:pPr>
       <w:r>
-        <w:t>6 Добавить оплату на сайте</w:t>
+        <w:t>5 Добавить оплату на сайте</w:t>
       </w:r>
     </w:p>
     <w:p>
@@ -370,7 +338,7 @@
         <w:pageBreakBefore w:val="0"/>
       </w:pPr>
       <w:r>
-        <w:t>7 Подготовить сайт к поисковикам и смене домена</w:t>
+        <w:t>6 Подготовить сайт к поисковикам и смене домена</w:t>
       </w:r>
     </w:p>
     <w:p>
@@ -428,7 +396,7 @@
         <w:pageBreakBefore w:val="0"/>
       </w:pPr>
       <w:r>
-        <w:t>8 Завершить каталог и проверить удобство сайта</w:t>
+        <w:t>7 Завершить каталог и проверить удобство сайта</w:t>
       </w:r>
     </w:p>
     <w:p>
@@ -486,7 +454,7 @@
         <w:pageBreakBefore/>
       </w:pPr>
       <w:r>
-        <w:t>9 Согласовать работу с персональными данными и аналитикой</w:t>
+        <w:t>8 Согласовать работу с персональными данными и аналитикой</w:t>
       </w:r>
     </w:p>
     <w:p>
@@ -495,7 +463,7 @@
         <w:pageBreakBefore w:val="0"/>
       </w:pPr>
       <w:r>
-        <w:t>С ответственным за персональные данные согласовать подтверждение в формах заказа и обратного звонка, а также сохранение факта согласия.</w:t>
+        <w:t>С ответственным за персональные данные согласовать сроки хранения данных по категориям заказов.</w:t>
       </w:r>
     </w:p>
     <w:p>
@@ -504,7 +472,7 @@
         <w:pageBreakBefore w:val="0"/>
       </w:pPr>
       <w:r>
-        <w:t>Определить сроки хранения данных, доступ сотрудников и порядок удаления.</w:t>
+        <w:t>Организовать удаление данных из ранее отправленных уведомлений, выгрузок и резервных копий; перед использованием восстановленной базы повторно очищать просроченные заявки.</w:t>
       </w:r>
     </w:p>
     <w:p>
@@ -513,7 +481,7 @@
         <w:pageBreakBefore w:val="0"/>
       </w:pPr>
       <w:r>
-        <w:t>Согласовать условия работы аналитики и уведомления о cookie.</w:t>
+        <w:t>Согласовать режим Яндекс Метрики и Webvisor, отправку целей и поведение уведомления о cookie; привести работу сайта к выбранному режиму.</w:t>
       </w:r>
     </w:p>
     <w:p>
@@ -523,7 +491,7 @@
         <w:pageBreakBefore w:val="0"/>
       </w:pPr>
       <w:r>
-        <w:t>Учесть передачу данных платёжному сервису и обновить опубликованные документы.</w:t>
+        <w:t>После выбора платёжного сервиса уточнить состав и условия передачи ему данных и обновить документы до запуска оплаты.</w:t>
       </w:r>
     </w:p>
     <w:p>
@@ -535,7 +503,7 @@
         <w:rPr>
           <w:i/>
         </w:rPr>
-        <w:t>Результат: формы, обработка данных и документы соответствуют согласованному порядку.</w:t>
+        <w:t>Результат: сроки по заказам и обработка внешних копий согласованы, аналитика работает по выбранному режиму, условия платёжного сервиса учтены перед запуском оплаты.</w:t>
       </w:r>
     </w:p>
     <w:p>
@@ -553,7 +521,7 @@
         <w:pageBreakBefore w:val="0"/>
       </w:pPr>
       <w:r>
-        <w:t>Получателей уведомлений и срок реакции менеджера на заказ и обратный звонок.</w:t>
+        <w:t>Срок реакции менеджера на заказ и обратный звонок.</w:t>
       </w:r>
     </w:p>
     <w:p>

</xml_diff>

<commit_message>
Require explicit consent for Metrika and Webvisor analytics
</commit_message>
<xml_diff>
--- a/docs/project-completion-plan-managers.docx
+++ b/docs/project-completion-plan-managers.docx
@@ -454,7 +454,7 @@
         <w:pageBreakBefore/>
       </w:pPr>
       <w:r>
-        <w:t>8 Согласовать работу с персональными данными и аналитикой</w:t>
+        <w:t>8 Завершить согласование обработки персональных данных</w:t>
       </w:r>
     </w:p>
     <w:p>
@@ -478,15 +478,6 @@
     <w:p>
       <w:pPr>
         <w:pStyle w:val="ListBullet"/>
-        <w:pageBreakBefore w:val="0"/>
-      </w:pPr>
-      <w:r>
-        <w:t>Согласовать режим Яндекс Метрики и Webvisor, отправку целей и поведение уведомления о cookie; привести работу сайта к выбранному режиму.</w:t>
-      </w:r>
-    </w:p>
-    <w:p>
-      <w:pPr>
-        <w:pStyle w:val="ListBullet"/>
         <w:keepNext/>
         <w:pageBreakBefore w:val="0"/>
       </w:pPr>
@@ -500,10 +491,7 @@
         <w:spacing w:after="180"/>
       </w:pPr>
       <w:r>
-        <w:rPr>
-          <w:i/>
-        </w:rPr>
-        <w:t>Результат: сроки по заказам и обработка внешних копий согласованы, аналитика работает по выбранному режиму, условия платёжного сервиса учтены перед запуском оплаты.</w:t>
+        <w:t>Результат: сроки по заказам и обработка внешних копий согласованы, условия платёжного сервиса учтены перед запуском оплаты.</w:t>
       </w:r>
     </w:p>
     <w:p>

</xml_diff>